<commit_message>
[58013] Frontend: KskServiceEditList - luong hien thi/xu ly giong Sua chi dinh dich vu
- 1 luoi dich vu co o chon: dich vu dang co tick san (mot phan BN co = long chung),
  bo tick = xoa, tick = them (BN da co bo qua), sua cot Phong thuc hien = doi phong
- "Phong thuc hien" loc luoi theo dich vu phong thuc hien duoc, la phong mac dinh khi them;
  cong tac Tat ca dich vu / Dich vu da chon; hang loc ma/ten/loai dich vu
- Nguon dich vu them: nhom dich vu KSK cua hop dong (HIS_KSK.KSK_CONTRACT_ID) + nhom dung chung
- API giu nguyen api/HisKskContract/ServiceEdit (chia lo 200 ho so)

Co-Authored-By: Claude Opus 5.5 (1M context) <noreply@anthropic.com>
</commit_message>
<xml_diff>
--- a/docs/58013_B_KyThuat_TreatmentList_SuaDichVuKsk.docx
+++ b/docs/58013_B_KyThuat_TreatmentList_SuaDichVuKsk.docx
@@ -3447,7 +3447,21 @@
           <w:rFonts w:ascii="Consolas" w:hAnsi="Consolas" w:cs="Consolas" w:eastAsia="Consolas"/>
           <w:sz w:val="18"/>
         </w:rPr>
-        <w:t xml:space="preserve">        OpenKskServiceEditList(treatments.Select(o =&gt; o.ID).ToList(), this.appliedKskContractId.Value);</w:t>
+        <w:t xml:space="preserve">        // Args: List&lt;V_HIS_TREATMENT_4&gt;, V_HIS_KSK_CONTRACT, RefeshReference</w:t>
+      </w:r>
+    </w:p>
+    <w:p>
+      <w:pPr>
+        <w:spacing w:after="0" w:before="0"/>
+        <w:ind w:left="170"/>
+        <w:shd w:val="clear" w:color="auto" w:fill="F4F4F4"/>
+      </w:pPr>
+      <w:r>
+        <w:rPr>
+          <w:rFonts w:ascii="Consolas" w:hAnsi="Consolas" w:cs="Consolas" w:eastAsia="Consolas"/>
+          <w:sz w:val="18"/>
+        </w:rPr>
+        <w:t xml:space="preserve">        OpenKskServiceEditList(treatments, contract);</w:t>
       </w:r>
     </w:p>
     <w:p>
@@ -3812,7 +3826,23 @@
           <w:rFonts w:ascii="Times New Roman" w:hAnsi="Times New Roman" w:cs="Times New Roman" w:eastAsia="Times New Roman"/>
           <w:b w:val="0"/>
         </w:rPr>
-        <w:t xml:space="preserve">Bổ sung control code mới trong </w:t>
+        <w:t xml:space="preserve">Bổ sung control code </w:t>
+      </w:r>
+      <w:r>
+        <w:rPr>
+          <w:rFonts w:ascii="Consolas" w:hAnsi="Consolas" w:cs="Consolas" w:eastAsia="Consolas"/>
+          <w:b w:val="0"/>
+          <w:color w:val="C7254E"/>
+          <w:sz w:val="20"/>
+        </w:rPr>
+        <w:t>HIS000060</w:t>
+      </w:r>
+      <w:r>
+        <w:rPr>
+          <w:rFonts w:ascii="Times New Roman" w:hAnsi="Times New Roman" w:cs="Times New Roman" w:eastAsia="Times New Roman"/>
+          <w:b w:val="0"/>
+        </w:rPr>
+        <w:t xml:space="preserve"> trong </w:t>
       </w:r>
       <w:r>
         <w:rPr>
@@ -3828,23 +3858,7 @@
           <w:rFonts w:ascii="Times New Roman" w:hAnsi="Times New Roman" w:cs="Times New Roman" w:eastAsia="Times New Roman"/>
           <w:b w:val="0"/>
         </w:rPr>
-        <w:t xml:space="preserve">, ví dụ </w:t>
-      </w:r>
-      <w:r>
-        <w:rPr>
-          <w:rFonts w:ascii="Consolas" w:hAnsi="Consolas" w:cs="Consolas" w:eastAsia="Consolas"/>
-          <w:b w:val="0"/>
-          <w:color w:val="C7254E"/>
-          <w:sz w:val="20"/>
-        </w:rPr>
-        <w:t>HIS000xxx</w:t>
-      </w:r>
-      <w:r>
-        <w:rPr>
-          <w:rFonts w:ascii="Times New Roman" w:hAnsi="Times New Roman" w:cs="Times New Roman" w:eastAsia="Times New Roman"/>
-          <w:b w:val="0"/>
-        </w:rPr>
-        <w:t xml:space="preserve"> — "Sửa dịch vụ KSK hợp đồng" (mã cụ thể do quản trị ACS cấp).</w:t>
+        <w:t xml:space="preserve"> — "Sửa dịch vụ KSK hợp đồng". Chưa khai báo ACS_CONTROL này → không kiểm soát (nút hiện theo điều kiện lọc); đã khai báo → người dùng phải có control qua vai trò.</w:t>
       </w:r>
     </w:p>
     <w:p>
@@ -10050,7 +10064,63 @@
           <w:rFonts w:ascii="Consolas" w:hAnsi="Consolas" w:cs="Consolas" w:eastAsia="Consolas"/>
           <w:sz w:val="18"/>
         </w:rPr>
-        <w:t>│   └── KskServiceEditListBehavior.cs   ← nhận KskServiceEditListADO</w:t>
+        <w:t>│   ├── KskServiceEditListBehavior.cs   ← nhận List&lt;V_HIS_TREATMENT_4&gt;, V_HIS_KSK_CONTRACT, RefeshReference</w:t>
+      </w:r>
+    </w:p>
+    <w:p>
+      <w:pPr>
+        <w:spacing w:after="0" w:before="0"/>
+        <w:ind w:left="170"/>
+        <w:shd w:val="clear" w:color="auto" w:fill="F4F4F4"/>
+      </w:pPr>
+      <w:r>
+        <w:rPr>
+          <w:rFonts w:ascii="Consolas" w:hAnsi="Consolas" w:cs="Consolas" w:eastAsia="Consolas"/>
+          <w:sz w:val="18"/>
+        </w:rPr>
+        <w:t>│   ├── frmKskServiceEditList.cs (+ Designer)</w:t>
+      </w:r>
+    </w:p>
+    <w:p>
+      <w:pPr>
+        <w:spacing w:after="0" w:before="0"/>
+        <w:ind w:left="170"/>
+        <w:shd w:val="clear" w:color="auto" w:fill="F4F4F4"/>
+      </w:pPr>
+      <w:r>
+        <w:rPr>
+          <w:rFonts w:ascii="Consolas" w:hAnsi="Consolas" w:cs="Consolas" w:eastAsia="Consolas"/>
+          <w:sz w:val="18"/>
+        </w:rPr>
+        <w:t>│   ├── frmKskServiceEditList__Load.cs  ← dựng dòng dịch vụ, combo</w:t>
+      </w:r>
+    </w:p>
+    <w:p>
+      <w:pPr>
+        <w:spacing w:after="0" w:before="0"/>
+        <w:ind w:left="170"/>
+        <w:shd w:val="clear" w:color="auto" w:fill="F4F4F4"/>
+      </w:pPr>
+      <w:r>
+        <w:rPr>
+          <w:rFonts w:ascii="Consolas" w:hAnsi="Consolas" w:cs="Consolas" w:eastAsia="Consolas"/>
+          <w:sz w:val="18"/>
+        </w:rPr>
+        <w:t>│   ├── frmKskServiceEditList__Grid.cs  ← lọc phòng, công tắc, ô chọn, cột phòng</w:t>
+      </w:r>
+    </w:p>
+    <w:p>
+      <w:pPr>
+        <w:spacing w:after="0" w:before="0"/>
+        <w:ind w:left="170"/>
+        <w:shd w:val="clear" w:color="auto" w:fill="F4F4F4"/>
+      </w:pPr>
+      <w:r>
+        <w:rPr>
+          <w:rFonts w:ascii="Consolas" w:hAnsi="Consolas" w:cs="Consolas" w:eastAsia="Consolas"/>
+          <w:sz w:val="18"/>
+        </w:rPr>
+        <w:t>│   └── frmKskServiceEditList__Save.cs  ← chuyển trạng thái lưới thành SDO, gọi Worker</w:t>
       </w:r>
     </w:p>
     <w:p>
@@ -10078,7 +10148,7 @@
           <w:rFonts w:ascii="Consolas" w:hAnsi="Consolas" w:cs="Consolas" w:eastAsia="Consolas"/>
           <w:sz w:val="18"/>
         </w:rPr>
-        <w:t>│   ├── KskServiceEditListADO.cs        ← TreatmentIds, KskContractId, DelegateRefresh</w:t>
+        <w:t>│   ├── ServiceRowADO.cs                ← 1 dòng lưới dịch vụ (gộp trên các hồ sơ)</w:t>
       </w:r>
     </w:p>
     <w:p>
@@ -10092,7 +10162,7 @@
           <w:rFonts w:ascii="Consolas" w:hAnsi="Consolas" w:cs="Consolas" w:eastAsia="Consolas"/>
           <w:sz w:val="18"/>
         </w:rPr>
-        <w:t>│   ├── ExistServiceADO.cs              ← dòng grid dịch vụ hiện có</w:t>
+        <w:t>│   ├── RoomADO.cs, KskServiceEditSDO.cs (bản sao SDO backend)</w:t>
       </w:r>
     </w:p>
     <w:p>
@@ -10106,7 +10176,7 @@
           <w:rFonts w:ascii="Consolas" w:hAnsi="Consolas" w:cs="Consolas" w:eastAsia="Consolas"/>
           <w:sz w:val="18"/>
         </w:rPr>
-        <w:t>│   └── AddServiceADO.cs                ← dòng grid dịch vụ thêm</w:t>
+        <w:t>│   └── KskServiceEditBatchResultADO.cs, KskServiceEditResultRowADO.cs</w:t>
       </w:r>
     </w:p>
     <w:p>
@@ -10120,7 +10190,7 @@
           <w:rFonts w:ascii="Consolas" w:hAnsi="Consolas" w:cs="Consolas" w:eastAsia="Consolas"/>
           <w:sz w:val="18"/>
         </w:rPr>
-        <w:t>├── Run/</w:t>
+        <w:t>├── Worker/KskServiceEditWorker.cs      ← lấy sere_serv, gọi API theo lô 200 (không để trong Form)</w:t>
       </w:r>
     </w:p>
     <w:p>
@@ -10134,7 +10204,7 @@
           <w:rFonts w:ascii="Consolas" w:hAnsi="Consolas" w:cs="Consolas" w:eastAsia="Consolas"/>
           <w:sz w:val="18"/>
         </w:rPr>
-        <w:t>│   └── KskServiceEditProcessor.cs      ← build SDO, gọi API (không để trong Form)</w:t>
+        <w:t>├── Result/frmKskServiceEditResult.cs   ← kết quả + xuất Excel</w:t>
       </w:r>
     </w:p>
     <w:p>
@@ -10148,35 +10218,7 @@
           <w:rFonts w:ascii="Consolas" w:hAnsi="Consolas" w:cs="Consolas" w:eastAsia="Consolas"/>
           <w:sz w:val="18"/>
         </w:rPr>
-        <w:t>├── frmKskServiceEditList.cs (+ __Designer)</w:t>
-      </w:r>
-    </w:p>
-    <w:p>
-      <w:pPr>
-        <w:spacing w:after="0" w:before="0"/>
-        <w:ind w:left="170"/>
-        <w:shd w:val="clear" w:color="auto" w:fill="F4F4F4"/>
-      </w:pPr>
-      <w:r>
-        <w:rPr>
-          <w:rFonts w:ascii="Consolas" w:hAnsi="Consolas" w:cs="Consolas" w:eastAsia="Consolas"/>
-          <w:sz w:val="18"/>
-        </w:rPr>
-        <w:t>├── frmKskServiceEditResult.cs          ← kết quả + xuất Excel</w:t>
-      </w:r>
-    </w:p>
-    <w:p>
-      <w:pPr>
-        <w:spacing w:after="0" w:before="0"/>
-        <w:ind w:left="170"/>
-        <w:shd w:val="clear" w:color="auto" w:fill="F4F4F4"/>
-      </w:pPr>
-      <w:r>
-        <w:rPr>
-          <w:rFonts w:ascii="Consolas" w:hAnsi="Consolas" w:cs="Consolas" w:eastAsia="Consolas"/>
-          <w:sz w:val="18"/>
-        </w:rPr>
-        <w:t>├── Resources/ Lang.vi/en, Message.Lang.vi/en, ResourceLanguageManager, ResourceMessage</w:t>
+        <w:t>├── Resources/ Lang(.vi/.en), Message.Lang(.vi/.en), ResourceLanguageManager, ResourceMessage</w:t>
       </w:r>
     </w:p>
     <w:p>
@@ -10201,19 +10243,10 @@
     <w:p>
       <w:r>
         <w:rPr>
-          <w:rFonts w:ascii="Consolas" w:hAnsi="Consolas" w:cs="Consolas" w:eastAsia="Consolas"/>
-          <w:b w:val="0"/>
-          <w:color w:val="C7254E"/>
-          <w:sz w:val="20"/>
-        </w:rPr>
-        <w:t>KskServiceEditListADO</w:t>
-      </w:r>
-      <w:r>
-        <w:rPr>
           <w:rFonts w:ascii="Times New Roman" w:hAnsi="Times New Roman" w:cs="Times New Roman" w:eastAsia="Times New Roman"/>
           <w:b w:val="0"/>
         </w:rPr>
-        <w:t xml:space="preserve"> đặt trong </w:t>
+        <w:t xml:space="preserve">Không dùng ADO chung trong </w:t>
       </w:r>
       <w:r>
         <w:rPr>
@@ -10229,7 +10262,7 @@
           <w:rFonts w:ascii="Times New Roman" w:hAnsi="Times New Roman" w:cs="Times New Roman" w:eastAsia="Times New Roman"/>
           <w:b w:val="0"/>
         </w:rPr>
-        <w:t xml:space="preserve"> để TreatmentList truyền sang qua </w:t>
+        <w:t xml:space="preserve"> (tránh phải build/deploy lại DLL đó): TreatmentList truyền thẳng </w:t>
       </w:r>
       <w:r>
         <w:rPr>
@@ -10238,7 +10271,23 @@
           <w:color w:val="C7254E"/>
           <w:sz w:val="20"/>
         </w:rPr>
-        <w:t>PluginInstance</w:t>
+        <w:t>List&lt;V_HIS_TREATMENT_4&gt;</w:t>
+      </w:r>
+      <w:r>
+        <w:rPr>
+          <w:rFonts w:ascii="Times New Roman" w:hAnsi="Times New Roman" w:cs="Times New Roman" w:eastAsia="Times New Roman"/>
+          <w:b w:val="0"/>
+        </w:rPr>
+        <w:t xml:space="preserve"> + </w:t>
+      </w:r>
+      <w:r>
+        <w:rPr>
+          <w:rFonts w:ascii="Consolas" w:hAnsi="Consolas" w:cs="Consolas" w:eastAsia="Consolas"/>
+          <w:b w:val="0"/>
+          <w:color w:val="C7254E"/>
+          <w:sz w:val="20"/>
+        </w:rPr>
+        <w:t>V_HIS_KSK_CONTRACT</w:t>
       </w:r>
       <w:r>
         <w:rPr>
@@ -10257,7 +10306,64 @@
           <w:rFonts w:ascii="Times New Roman" w:hAnsi="Times New Roman" w:cs="Times New Roman" w:eastAsia="Times New Roman"/>
           <w:b w:val="0"/>
         </w:rPr>
-        <w:t>5.2. Bố cục màn hình (tương tự Sửa chỉ định dịch vụ)</w:t>
+        <w:t>5.2. Bố cục màn hình (luồng giống "Sửa chỉ định dịch vụ")</w:t>
+      </w:r>
+    </w:p>
+    <w:p>
+      <w:r>
+        <w:rPr>
+          <w:rFonts w:ascii="Times New Roman" w:hAnsi="Times New Roman" w:cs="Times New Roman" w:eastAsia="Times New Roman"/>
+          <w:b w:val="0"/>
+        </w:rPr>
+        <w:t xml:space="preserve">Màn hình giữ đúng cách dùng của </w:t>
+      </w:r>
+      <w:r>
+        <w:rPr>
+          <w:rFonts w:ascii="Times New Roman" w:hAnsi="Times New Roman" w:cs="Times New Roman" w:eastAsia="Times New Roman"/>
+          <w:b/>
+        </w:rPr>
+        <w:t>Sửa chỉ định dịch vụ (AssignServiceEdit)</w:t>
+      </w:r>
+      <w:r>
+        <w:rPr>
+          <w:rFonts w:ascii="Times New Roman" w:hAnsi="Times New Roman" w:cs="Times New Roman" w:eastAsia="Times New Roman"/>
+          <w:b w:val="0"/>
+        </w:rPr>
+        <w:t>: một lưới dịch vụ có ô chọn,</w:t>
+      </w:r>
+    </w:p>
+    <w:p>
+      <w:r>
+        <w:rPr>
+          <w:rFonts w:ascii="Times New Roman" w:hAnsi="Times New Roman" w:cs="Times New Roman" w:eastAsia="Times New Roman"/>
+          <w:b w:val="0"/>
+        </w:rPr>
+        <w:t>dịch vụ đang có được tick sẵn; tick / bỏ tick / sửa phòng rồi Lưu. Khác biệt duy nhất là dữ liệu gộp trên</w:t>
+      </w:r>
+    </w:p>
+    <w:p>
+      <w:r>
+        <w:rPr>
+          <w:rFonts w:ascii="Times New Roman" w:hAnsi="Times New Roman" w:cs="Times New Roman" w:eastAsia="Times New Roman"/>
+          <w:b w:val="0"/>
+        </w:rPr>
+        <w:t xml:space="preserve">nhiều hồ sơ và Lưu gọi API mới </w:t>
+      </w:r>
+      <w:r>
+        <w:rPr>
+          <w:rFonts w:ascii="Consolas" w:hAnsi="Consolas" w:cs="Consolas" w:eastAsia="Consolas"/>
+          <w:b w:val="0"/>
+          <w:color w:val="C7254E"/>
+          <w:sz w:val="20"/>
+        </w:rPr>
+        <w:t>api/HisKskContract/ServiceEdit</w:t>
+      </w:r>
+      <w:r>
+        <w:rPr>
+          <w:rFonts w:ascii="Times New Roman" w:hAnsi="Times New Roman" w:cs="Times New Roman" w:eastAsia="Times New Roman"/>
+          <w:b w:val="0"/>
+        </w:rPr>
+        <w:t>.</w:t>
       </w:r>
     </w:p>
     <w:p>
@@ -10271,7 +10377,7 @@
           <w:rFonts w:ascii="Consolas" w:hAnsi="Consolas" w:cs="Consolas" w:eastAsia="Consolas"/>
           <w:sz w:val="18"/>
         </w:rPr>
-        <w:t>┌──────────────────────────────────────────────────────────────────────┐</w:t>
+        <w:t>┌──────────────────────────────────────────────────────────────────────────┐</w:t>
       </w:r>
     </w:p>
     <w:p>
@@ -10285,7 +10391,7 @@
           <w:rFonts w:ascii="Consolas" w:hAnsi="Consolas" w:cs="Consolas" w:eastAsia="Consolas"/>
           <w:sz w:val="18"/>
         </w:rPr>
-        <w:t>│ Hợp đồng: HD001 - Cty ABC     Áp dụng cho: 350 bệnh nhân             │</w:t>
+        <w:t>│ Hợp đồng: HD001 - Cty ABC                     Số bệnh nhân: 350 bệnh nhân │</w:t>
       </w:r>
     </w:p>
     <w:p>
@@ -10299,7 +10405,7 @@
           <w:rFonts w:ascii="Consolas" w:hAnsi="Consolas" w:cs="Consolas" w:eastAsia="Consolas"/>
           <w:sz w:val="18"/>
         </w:rPr>
-        <w:t>│ Người chỉ định: [cboLogin ▼]   Thời gian y lệnh: [dtIntructionTime]  │</w:t>
+        <w:t>│ Thời gian chỉ định:[dt]   Phòng thực hiện:[cboRoom]   Người chỉ định:[cbo] │</w:t>
       </w:r>
     </w:p>
     <w:p>
@@ -10313,7 +10419,7 @@
           <w:rFonts w:ascii="Consolas" w:hAnsi="Consolas" w:cs="Consolas" w:eastAsia="Consolas"/>
           <w:sz w:val="18"/>
         </w:rPr>
-        <w:t>├──────────────────────────────────────────────────────────────────────┤</w:t>
+        <w:t>├──────────────────────────────────────────────────────────────────────────┤</w:t>
       </w:r>
     </w:p>
     <w:p>
@@ -10327,7 +10433,7 @@
           <w:rFonts w:ascii="Consolas" w:hAnsi="Consolas" w:cs="Consolas" w:eastAsia="Consolas"/>
           <w:sz w:val="18"/>
         </w:rPr>
-        <w:t>│ DỊCH VỤ HIỆN CÓ                                                      │</w:t>
+        <w:t>│ ☐ │Mã DV│Tên DV   │Phòng thực hiện ▼│Số BN có│Đã thực hiện│SL│Đơn giá│Loại│</w:t>
       </w:r>
     </w:p>
     <w:p>
@@ -10341,7 +10447,7 @@
           <w:rFonts w:ascii="Consolas" w:hAnsi="Consolas" w:cs="Consolas" w:eastAsia="Consolas"/>
           <w:sz w:val="18"/>
         </w:rPr>
-        <w:t>│ STT│Mã DV│Tên DV│Loại DV│Số BN có│Phòng hiện tại│Xóa│Phòng mới ▼      │</w:t>
+        <w:t>│ ☑ │XN01 │CTM      │P.Xét nghiệm     │350/350 │0           │1 │ ...   │XN  │</w:t>
       </w:r>
     </w:p>
     <w:p>
@@ -10355,7 +10461,7 @@
           <w:rFonts w:ascii="Consolas" w:hAnsi="Consolas" w:cs="Consolas" w:eastAsia="Consolas"/>
           <w:sz w:val="18"/>
         </w:rPr>
-        <w:t>│  1 │XN01 │CTM   │XN     │350/350 │P.Xét nghiệm  │☐ │                 │</w:t>
+        <w:t>│ ▣ │SA01 │SA bụng  │P.Siêu âm        │120/350 │0           │1 │ ...   │CĐHA│</w:t>
       </w:r>
     </w:p>
     <w:p>
@@ -10369,7 +10475,7 @@
           <w:rFonts w:ascii="Consolas" w:hAnsi="Consolas" w:cs="Consolas" w:eastAsia="Consolas"/>
           <w:sz w:val="18"/>
         </w:rPr>
-        <w:t>│  2 │SA01 │SA bụng│CĐHA  │348/350 │Nhiều phòng   │☐ │P.Siêu âm 2      │</w:t>
+        <w:t>│ ☐ │DT01 │Điện tim │P.TDCN           │0/350   │0           │1 │ ...   │TDCN│</w:t>
       </w:r>
     </w:p>
     <w:p>
@@ -10383,7 +10489,7 @@
           <w:rFonts w:ascii="Consolas" w:hAnsi="Consolas" w:cs="Consolas" w:eastAsia="Consolas"/>
           <w:sz w:val="18"/>
         </w:rPr>
-        <w:t>├──────────────────────────────────────────────────────────────────────┤</w:t>
+        <w:t>├──────────────────────────────────────────────────────────────────────────┤</w:t>
       </w:r>
     </w:p>
     <w:p>
@@ -10397,7 +10503,7 @@
           <w:rFonts w:ascii="Consolas" w:hAnsi="Consolas" w:cs="Consolas" w:eastAsia="Consolas"/>
           <w:sz w:val="18"/>
         </w:rPr>
-        <w:t>│ THÊM DỊCH VỤ                                                         │</w:t>
+        <w:t>│ (Tất cả dịch vụ | Dịch vụ đã chọn)                         [Lưu (Ctrl S)] │</w:t>
       </w:r>
     </w:p>
     <w:p>
@@ -10411,63 +10517,7 @@
           <w:rFonts w:ascii="Consolas" w:hAnsi="Consolas" w:cs="Consolas" w:eastAsia="Consolas"/>
           <w:sz w:val="18"/>
         </w:rPr>
-        <w:t>│ Nhóm DV KSK: [cboKsk ▼]  Dịch vụ: [cboKskService ▼] Phòng: [cbo ▼] [Thêm]│</w:t>
-      </w:r>
-    </w:p>
-    <w:p>
-      <w:pPr>
-        <w:spacing w:after="0" w:before="0"/>
-        <w:ind w:left="170"/>
-        <w:shd w:val="clear" w:color="auto" w:fill="F4F4F4"/>
-      </w:pPr>
-      <w:r>
-        <w:rPr>
-          <w:rFonts w:ascii="Consolas" w:hAnsi="Consolas" w:cs="Consolas" w:eastAsia="Consolas"/>
-          <w:sz w:val="18"/>
-        </w:rPr>
-        <w:t>│ STT│Mã DV│Tên DV│Nhóm DV KSK│Phòng thực hiện│Số lượng│Đơn giá│[Xóa dòng]│</w:t>
-      </w:r>
-    </w:p>
-    <w:p>
-      <w:pPr>
-        <w:spacing w:after="0" w:before="0"/>
-        <w:ind w:left="170"/>
-        <w:shd w:val="clear" w:color="auto" w:fill="F4F4F4"/>
-      </w:pPr>
-      <w:r>
-        <w:rPr>
-          <w:rFonts w:ascii="Consolas" w:hAnsi="Consolas" w:cs="Consolas" w:eastAsia="Consolas"/>
-          <w:sz w:val="18"/>
-        </w:rPr>
-        <w:t>├──────────────────────────────────────────────────────────────────────┤</w:t>
-      </w:r>
-    </w:p>
-    <w:p>
-      <w:pPr>
-        <w:spacing w:after="0" w:before="0"/>
-        <w:ind w:left="170"/>
-        <w:shd w:val="clear" w:color="auto" w:fill="F4F4F4"/>
-      </w:pPr>
-      <w:r>
-        <w:rPr>
-          <w:rFonts w:ascii="Consolas" w:hAnsi="Consolas" w:cs="Consolas" w:eastAsia="Consolas"/>
-          <w:sz w:val="18"/>
-        </w:rPr>
-        <w:t>│                                               [Lưu (Ctrl+S)]         │</w:t>
-      </w:r>
-    </w:p>
-    <w:p>
-      <w:pPr>
-        <w:spacing w:after="0" w:before="0"/>
-        <w:ind w:left="170"/>
-        <w:shd w:val="clear" w:color="auto" w:fill="F4F4F4"/>
-      </w:pPr>
-      <w:r>
-        <w:rPr>
-          <w:rFonts w:ascii="Consolas" w:hAnsi="Consolas" w:cs="Consolas" w:eastAsia="Consolas"/>
-          <w:sz w:val="18"/>
-        </w:rPr>
-        <w:t>└──────────────────────────────────────────────────────────────────────┘</w:t>
+        <w:t>└──────────────────────────────────────────────────────────────────────────┘</w:t>
       </w:r>
     </w:p>
     <w:p>
@@ -10490,7 +10540,7 @@
       <w:tr>
         <w:tc>
           <w:tcPr>
-            <w:tcW w:type="dxa" w:w="1805"/>
+            <w:tcW w:type="dxa" w:w="4103"/>
             <w:shd w:val="clear" w:color="auto" w:fill="DDEBF7"/>
           </w:tcPr>
           <w:p>
@@ -10503,13 +10553,13 @@
                 <w:b/>
                 <w:sz w:val="20"/>
               </w:rPr>
-              <w:t>Vùng</w:t>
+              <w:t>Thành phần</w:t>
             </w:r>
           </w:p>
         </w:tc>
         <w:tc>
           <w:tcPr>
-            <w:tcW w:type="dxa" w:w="7221"/>
+            <w:tcW w:type="dxa" w:w="4923"/>
             <w:shd w:val="clear" w:color="auto" w:fill="DDEBF7"/>
           </w:tcPr>
           <w:p>
@@ -10530,7 +10580,7 @@
       <w:tr>
         <w:tc>
           <w:tcPr>
-            <w:tcW w:type="dxa" w:w="1805"/>
+            <w:tcW w:type="dxa" w:w="4103"/>
           </w:tcPr>
           <w:p>
             <w:pPr>
@@ -10542,13 +10592,13 @@
                 <w:b w:val="0"/>
                 <w:sz w:val="20"/>
               </w:rPr>
-              <w:t>Header</w:t>
+              <w:t>Nguồn dòng</w:t>
             </w:r>
           </w:p>
         </w:tc>
         <w:tc>
           <w:tcPr>
-            <w:tcW w:type="dxa" w:w="7221"/>
+            <w:tcW w:type="dxa" w:w="4923"/>
           </w:tcPr>
           <w:p>
             <w:pPr>
@@ -10560,7 +10610,7 @@
                 <w:b w:val="0"/>
                 <w:sz w:val="20"/>
               </w:rPr>
-              <w:t xml:space="preserve">"Áp dụng cho N bệnh nhân" = số </w:t>
+              <w:t>Dịch vụ các hồ sơ đang có (</w:t>
             </w:r>
             <w:r>
               <w:rPr>
@@ -10569,15 +10619,49 @@
                 <w:color w:val="C7254E"/>
                 <w:sz w:val="18"/>
               </w:rPr>
-              <w:t>TreatmentIds</w:t>
-            </w:r>
-            <w:r>
-              <w:rPr>
-                <w:rFonts w:ascii="Times New Roman" w:hAnsi="Times New Roman" w:cs="Times New Roman" w:eastAsia="Times New Roman"/>
-                <w:b w:val="0"/>
-                <w:sz w:val="20"/>
-              </w:rPr>
-              <w:t>. Hợp đồng readonly. Người chỉ định mặc định = tài khoản đăng nhập. Thời gian y lệnh mặc định = hiện tại</w:t>
+              <w:t>api/HisSereServ/Get</w:t>
+            </w:r>
+            <w:r>
+              <w:rPr>
+                <w:rFonts w:ascii="Times New Roman" w:hAnsi="Times New Roman" w:cs="Times New Roman" w:eastAsia="Times New Roman"/>
+                <w:b w:val="0"/>
+                <w:sz w:val="20"/>
+              </w:rPr>
+              <w:t xml:space="preserve"> theo </w:t>
+            </w:r>
+            <w:r>
+              <w:rPr>
+                <w:rFonts w:ascii="Consolas" w:hAnsi="Consolas" w:cs="Consolas" w:eastAsia="Consolas"/>
+                <w:b w:val="0"/>
+                <w:color w:val="C7254E"/>
+                <w:sz w:val="18"/>
+              </w:rPr>
+              <w:t>TREATMENT_IDs</w:t>
+            </w:r>
+            <w:r>
+              <w:rPr>
+                <w:rFonts w:ascii="Times New Roman" w:hAnsi="Times New Roman" w:cs="Times New Roman" w:eastAsia="Times New Roman"/>
+                <w:b w:val="0"/>
+                <w:sz w:val="20"/>
+              </w:rPr>
+              <w:t>, lô 100) ∪ dịch vụ trong nhóm dịch vụ KSK của hợp đồng (</w:t>
+            </w:r>
+            <w:r>
+              <w:rPr>
+                <w:rFonts w:ascii="Consolas" w:hAnsi="Consolas" w:cs="Consolas" w:eastAsia="Consolas"/>
+                <w:b w:val="0"/>
+                <w:color w:val="C7254E"/>
+                <w:sz w:val="18"/>
+              </w:rPr>
+              <w:t>HIS_KSK.KSK_CONTRACT_ID</w:t>
+            </w:r>
+            <w:r>
+              <w:rPr>
+                <w:rFonts w:ascii="Times New Roman" w:hAnsi="Times New Roman" w:cs="Times New Roman" w:eastAsia="Times New Roman"/>
+                <w:b w:val="0"/>
+                <w:sz w:val="20"/>
+              </w:rPr>
+              <w:t>) và nhóm dùng chung. Dịch vụ đã chọn xếp đầu</w:t>
             </w:r>
           </w:p>
         </w:tc>
@@ -10585,7 +10669,7 @@
       <w:tr>
         <w:tc>
           <w:tcPr>
-            <w:tcW w:type="dxa" w:w="1805"/>
+            <w:tcW w:type="dxa" w:w="4103"/>
           </w:tcPr>
           <w:p>
             <w:pPr>
@@ -10597,13 +10681,13 @@
                 <w:b w:val="0"/>
                 <w:sz w:val="20"/>
               </w:rPr>
-              <w:t>Dịch vụ hiện có</w:t>
+              <w:t>Ô chọn</w:t>
             </w:r>
           </w:p>
         </w:tc>
         <w:tc>
           <w:tcPr>
-            <w:tcW w:type="dxa" w:w="7221"/>
+            <w:tcW w:type="dxa" w:w="4923"/>
           </w:tcPr>
           <w:p>
             <w:pPr>
@@ -10615,75 +10699,7 @@
                 <w:b w:val="0"/>
                 <w:sz w:val="20"/>
               </w:rPr>
-              <w:t xml:space="preserve">Load </w:t>
-            </w:r>
-            <w:r>
-              <w:rPr>
-                <w:rFonts w:ascii="Consolas" w:hAnsi="Consolas" w:cs="Consolas" w:eastAsia="Consolas"/>
-                <w:b w:val="0"/>
-                <w:color w:val="C7254E"/>
-                <w:sz w:val="18"/>
-              </w:rPr>
-              <w:t>api/HisSereServ/Get</w:t>
-            </w:r>
-            <w:r>
-              <w:rPr>
-                <w:rFonts w:ascii="Times New Roman" w:hAnsi="Times New Roman" w:cs="Times New Roman" w:eastAsia="Times New Roman"/>
-                <w:b w:val="0"/>
-                <w:sz w:val="20"/>
-              </w:rPr>
-              <w:t xml:space="preserve"> với </w:t>
-            </w:r>
-            <w:r>
-              <w:rPr>
-                <w:rFonts w:ascii="Consolas" w:hAnsi="Consolas" w:cs="Consolas" w:eastAsia="Consolas"/>
-                <w:b w:val="0"/>
-                <w:color w:val="C7254E"/>
-                <w:sz w:val="18"/>
-              </w:rPr>
-              <w:t>TREATMENT_IDs</w:t>
-            </w:r>
-            <w:r>
-              <w:rPr>
-                <w:rFonts w:ascii="Times New Roman" w:hAnsi="Times New Roman" w:cs="Times New Roman" w:eastAsia="Times New Roman"/>
-                <w:b w:val="0"/>
-                <w:sz w:val="20"/>
-              </w:rPr>
-              <w:t xml:space="preserve"> (chia lô 100 id/lần), </w:t>
-            </w:r>
-            <w:r>
-              <w:rPr>
-                <w:rFonts w:ascii="Consolas" w:hAnsi="Consolas" w:cs="Consolas" w:eastAsia="Consolas"/>
-                <w:b w:val="0"/>
-                <w:color w:val="C7254E"/>
-                <w:sz w:val="18"/>
-              </w:rPr>
-              <w:t>IS_DELETE = 0</w:t>
-            </w:r>
-            <w:r>
-              <w:rPr>
-                <w:rFonts w:ascii="Times New Roman" w:hAnsi="Times New Roman" w:cs="Times New Roman" w:eastAsia="Times New Roman"/>
-                <w:b w:val="0"/>
-                <w:sz w:val="20"/>
-              </w:rPr>
-              <w:t xml:space="preserve">; gộp theo </w:t>
-            </w:r>
-            <w:r>
-              <w:rPr>
-                <w:rFonts w:ascii="Consolas" w:hAnsi="Consolas" w:cs="Consolas" w:eastAsia="Consolas"/>
-                <w:b w:val="0"/>
-                <w:color w:val="C7254E"/>
-                <w:sz w:val="18"/>
-              </w:rPr>
-              <w:t>SERVICE_ID</w:t>
-            </w:r>
-            <w:r>
-              <w:rPr>
-                <w:rFonts w:ascii="Times New Roman" w:hAnsi="Times New Roman" w:cs="Times New Roman" w:eastAsia="Times New Roman"/>
-                <w:b w:val="0"/>
-                <w:sz w:val="20"/>
-              </w:rPr>
-              <w:t>. "Số BN có" = số hồ sơ có dịch vụ / N. "Phòng hiện tại" = tên phòng nếu duy nhất, ngược lại "Nhiều phòng" (tooltip liệt kê)</w:t>
+              <w:t>Tất cả BN có → ☑; một phần BN có → ▣ (lưng chừng); chưa có → ☐</w:t>
             </w:r>
           </w:p>
         </w:tc>
@@ -10691,7 +10707,7 @@
       <w:tr>
         <w:tc>
           <w:tcPr>
-            <w:tcW w:type="dxa" w:w="1805"/>
+            <w:tcW w:type="dxa" w:w="4103"/>
           </w:tcPr>
           <w:p>
             <w:pPr>
@@ -10703,13 +10719,13 @@
                 <w:b w:val="0"/>
                 <w:sz w:val="20"/>
               </w:rPr>
-              <w:t>Xóa / Phòng mới</w:t>
+              <w:t>Bỏ tick dịch vụ đang có</w:t>
             </w:r>
           </w:p>
         </w:tc>
         <w:tc>
           <w:tcPr>
-            <w:tcW w:type="dxa" w:w="7221"/>
+            <w:tcW w:type="dxa" w:w="4923"/>
           </w:tcPr>
           <w:p>
             <w:pPr>
@@ -10718,27 +10734,18 @@
             <w:r>
               <w:rPr>
                 <w:rFonts w:ascii="Times New Roman" w:hAnsi="Times New Roman" w:cs="Times New Roman" w:eastAsia="Times New Roman"/>
-                <w:b w:val="0"/>
-                <w:sz w:val="20"/>
-              </w:rPr>
-              <w:t xml:space="preserve">Loại trừ nhau: tick Xóa → clear + khóa Phòng mới; chọn Phòng mới → bỏ tick Xóa. Combo Phòng mới chỉ gồm phòng trong </w:t>
-            </w:r>
-            <w:r>
-              <w:rPr>
-                <w:rFonts w:ascii="Consolas" w:hAnsi="Consolas" w:cs="Consolas" w:eastAsia="Consolas"/>
-                <w:b w:val="0"/>
-                <w:color w:val="C7254E"/>
-                <w:sz w:val="18"/>
-              </w:rPr>
-              <w:t>V_HIS_SERVICE_ROOM</w:t>
-            </w:r>
-            <w:r>
-              <w:rPr>
-                <w:rFonts w:ascii="Times New Roman" w:hAnsi="Times New Roman" w:cs="Times New Roman" w:eastAsia="Times New Roman"/>
-                <w:b w:val="0"/>
-                <w:sz w:val="20"/>
-              </w:rPr>
-              <w:t xml:space="preserve"> của dịch vụ</w:t>
+                <w:b/>
+                <w:sz w:val="20"/>
+              </w:rPr>
+              <w:t>Xóa</w:t>
+            </w:r>
+            <w:r>
+              <w:rPr>
+                <w:rFonts w:ascii="Times New Roman" w:hAnsi="Times New Roman" w:cs="Times New Roman" w:eastAsia="Times New Roman"/>
+                <w:b w:val="0"/>
+                <w:sz w:val="20"/>
+              </w:rPr>
+              <w:t xml:space="preserve"> khỏi mọi hồ sơ đã chọn</w:t>
             </w:r>
           </w:p>
         </w:tc>
@@ -10746,7 +10753,7 @@
       <w:tr>
         <w:tc>
           <w:tcPr>
-            <w:tcW w:type="dxa" w:w="1805"/>
+            <w:tcW w:type="dxa" w:w="4103"/>
           </w:tcPr>
           <w:p>
             <w:pPr>
@@ -10758,13 +10765,13 @@
                 <w:b w:val="0"/>
                 <w:sz w:val="20"/>
               </w:rPr>
-              <w:t>Thêm dịch vụ</w:t>
+              <w:t>Tick dịch vụ chưa có / tick hẳn dịch vụ lưng chừng</w:t>
             </w:r>
           </w:p>
         </w:tc>
         <w:tc>
           <w:tcPr>
-            <w:tcW w:type="dxa" w:w="7221"/>
+            <w:tcW w:type="dxa" w:w="4923"/>
           </w:tcPr>
           <w:p>
             <w:pPr>
@@ -10772,88 +10779,19 @@
             </w:pPr>
             <w:r>
               <w:rPr>
-                <w:rFonts w:ascii="Consolas" w:hAnsi="Consolas" w:cs="Consolas" w:eastAsia="Consolas"/>
-                <w:b w:val="0"/>
-                <w:color w:val="C7254E"/>
-                <w:sz w:val="18"/>
-              </w:rPr>
-              <w:t>cboKsk</w:t>
-            </w:r>
-            <w:r>
-              <w:rPr>
-                <w:rFonts w:ascii="Times New Roman" w:hAnsi="Times New Roman" w:cs="Times New Roman" w:eastAsia="Times New Roman"/>
-                <w:b w:val="0"/>
-                <w:sz w:val="20"/>
-              </w:rPr>
-              <w:t xml:space="preserve"> = </w:t>
-            </w:r>
-            <w:r>
-              <w:rPr>
-                <w:rFonts w:ascii="Consolas" w:hAnsi="Consolas" w:cs="Consolas" w:eastAsia="Consolas"/>
-                <w:b w:val="0"/>
-                <w:color w:val="C7254E"/>
-                <w:sz w:val="18"/>
-              </w:rPr>
-              <w:t>HIS_KSK</w:t>
-            </w:r>
-            <w:r>
-              <w:rPr>
-                <w:rFonts w:ascii="Times New Roman" w:hAnsi="Times New Roman" w:cs="Times New Roman" w:eastAsia="Times New Roman"/>
-                <w:b w:val="0"/>
-                <w:sz w:val="20"/>
-              </w:rPr>
-              <w:t xml:space="preserve"> đang hoạt động; </w:t>
-            </w:r>
-            <w:r>
-              <w:rPr>
-                <w:rFonts w:ascii="Consolas" w:hAnsi="Consolas" w:cs="Consolas" w:eastAsia="Consolas"/>
-                <w:b w:val="0"/>
-                <w:color w:val="C7254E"/>
-                <w:sz w:val="18"/>
-              </w:rPr>
-              <w:t>cboKskService</w:t>
-            </w:r>
-            <w:r>
-              <w:rPr>
-                <w:rFonts w:ascii="Times New Roman" w:hAnsi="Times New Roman" w:cs="Times New Roman" w:eastAsia="Times New Roman"/>
-                <w:b w:val="0"/>
-                <w:sz w:val="20"/>
-              </w:rPr>
-              <w:t xml:space="preserve"> = </w:t>
-            </w:r>
-            <w:r>
-              <w:rPr>
-                <w:rFonts w:ascii="Consolas" w:hAnsi="Consolas" w:cs="Consolas" w:eastAsia="Consolas"/>
-                <w:b w:val="0"/>
-                <w:color w:val="C7254E"/>
-                <w:sz w:val="18"/>
-              </w:rPr>
-              <w:t>HIS_KSK_SERVICE</w:t>
-            </w:r>
-            <w:r>
-              <w:rPr>
-                <w:rFonts w:ascii="Times New Roman" w:hAnsi="Times New Roman" w:cs="Times New Roman" w:eastAsia="Times New Roman"/>
-                <w:b w:val="0"/>
-                <w:sz w:val="20"/>
-              </w:rPr>
-              <w:t xml:space="preserve"> của nhóm; Phòng mặc định </w:t>
-            </w:r>
-            <w:r>
-              <w:rPr>
-                <w:rFonts w:ascii="Consolas" w:hAnsi="Consolas" w:cs="Consolas" w:eastAsia="Consolas"/>
-                <w:b w:val="0"/>
-                <w:color w:val="C7254E"/>
-                <w:sz w:val="18"/>
-              </w:rPr>
-              <w:t>KSK_SERVICE.ROOM_ID</w:t>
-            </w:r>
-            <w:r>
-              <w:rPr>
-                <w:rFonts w:ascii="Times New Roman" w:hAnsi="Times New Roman" w:cs="Times New Roman" w:eastAsia="Times New Roman"/>
-                <w:b w:val="0"/>
-                <w:sz w:val="20"/>
-              </w:rPr>
-              <w:t>. Không cho thêm trùng dòng; dịch vụ đang tick Xóa không được thêm lại</w:t>
+                <w:rFonts w:ascii="Times New Roman" w:hAnsi="Times New Roman" w:cs="Times New Roman" w:eastAsia="Times New Roman"/>
+                <w:b/>
+                <w:sz w:val="20"/>
+              </w:rPr>
+              <w:t>Thêm</w:t>
+            </w:r>
+            <w:r>
+              <w:rPr>
+                <w:rFonts w:ascii="Times New Roman" w:hAnsi="Times New Roman" w:cs="Times New Roman" w:eastAsia="Times New Roman"/>
+                <w:b w:val="0"/>
+                <w:sz w:val="20"/>
+              </w:rPr>
+              <w:t xml:space="preserve"> (BN đã có được bỏ qua); phải thuộc nhóm DV KSK, nếu không → cảnh báo</w:t>
             </w:r>
           </w:p>
         </w:tc>
@@ -10861,7 +10799,7 @@
       <w:tr>
         <w:tc>
           <w:tcPr>
-            <w:tcW w:type="dxa" w:w="1805"/>
+            <w:tcW w:type="dxa" w:w="4103"/>
           </w:tcPr>
           <w:p>
             <w:pPr>
@@ -10873,13 +10811,13 @@
                 <w:b w:val="0"/>
                 <w:sz w:val="20"/>
               </w:rPr>
-              <w:t>Lưu</w:t>
+              <w:t>Sửa cột "Phòng thực hiện"</w:t>
             </w:r>
           </w:p>
         </w:tc>
         <w:tc>
           <w:tcPr>
-            <w:tcW w:type="dxa" w:w="7221"/>
+            <w:tcW w:type="dxa" w:w="4923"/>
           </w:tcPr>
           <w:p>
             <w:pPr>
@@ -10891,7 +10829,7 @@
                 <w:b w:val="0"/>
                 <w:sz w:val="20"/>
               </w:rPr>
-              <w:t xml:space="preserve">Không có thay đổi → cảnh báo. Xác nhận "Áp dụng thay đổi cho N bệnh nhân?" → </w:t>
+              <w:t xml:space="preserve">Dịch vụ tất cả BN đang có → </w:t>
             </w:r>
             <w:r>
               <w:rPr>
@@ -10899,6 +10837,212 @@
                 <w:b/>
                 <w:sz w:val="20"/>
               </w:rPr>
+              <w:t>đổi phòng</w:t>
+            </w:r>
+            <w:r>
+              <w:rPr>
+                <w:rFonts w:ascii="Times New Roman" w:hAnsi="Times New Roman" w:cs="Times New Roman" w:eastAsia="Times New Roman"/>
+                <w:b w:val="0"/>
+                <w:sz w:val="20"/>
+              </w:rPr>
+              <w:t>; dịch vụ thêm → phòng thực hiện khi thêm (trống → phòng theo nhóm KSK). Chỉ sửa khi dòng đang tick</w:t>
+            </w:r>
+          </w:p>
+        </w:tc>
+      </w:tr>
+      <w:tr>
+        <w:tc>
+          <w:tcPr>
+            <w:tcW w:type="dxa" w:w="4103"/>
+          </w:tcPr>
+          <w:p>
+            <w:pPr>
+              <w:spacing w:after="0"/>
+            </w:pPr>
+            <w:r>
+              <w:rPr>
+                <w:rFonts w:ascii="Times New Roman" w:hAnsi="Times New Roman" w:cs="Times New Roman" w:eastAsia="Times New Roman"/>
+                <w:b w:val="0"/>
+                <w:sz w:val="20"/>
+              </w:rPr>
+              <w:t>"Phòng thực hiện" (trên)</w:t>
+            </w:r>
+          </w:p>
+        </w:tc>
+        <w:tc>
+          <w:tcPr>
+            <w:tcW w:type="dxa" w:w="4923"/>
+          </w:tcPr>
+          <w:p>
+            <w:pPr>
+              <w:spacing w:after="0"/>
+            </w:pPr>
+            <w:r>
+              <w:rPr>
+                <w:rFonts w:ascii="Times New Roman" w:hAnsi="Times New Roman" w:cs="Times New Roman" w:eastAsia="Times New Roman"/>
+                <w:b w:val="0"/>
+                <w:sz w:val="20"/>
+              </w:rPr>
+              <w:t>Như AssignServiceEdit: lọc lưới theo dịch vụ phòng đó thực hiện được (dòng đang có / đang tick luôn hiện); là phòng mặc định khi tick thêm</w:t>
+            </w:r>
+          </w:p>
+        </w:tc>
+      </w:tr>
+      <w:tr>
+        <w:tc>
+          <w:tcPr>
+            <w:tcW w:type="dxa" w:w="4103"/>
+          </w:tcPr>
+          <w:p>
+            <w:pPr>
+              <w:spacing w:after="0"/>
+            </w:pPr>
+            <w:r>
+              <w:rPr>
+                <w:rFonts w:ascii="Times New Roman" w:hAnsi="Times New Roman" w:cs="Times New Roman" w:eastAsia="Times New Roman"/>
+                <w:b w:val="0"/>
+                <w:sz w:val="20"/>
+              </w:rPr>
+              <w:t>Công tắc</w:t>
+            </w:r>
+          </w:p>
+        </w:tc>
+        <w:tc>
+          <w:tcPr>
+            <w:tcW w:type="dxa" w:w="4923"/>
+          </w:tcPr>
+          <w:p>
+            <w:pPr>
+              <w:spacing w:after="0"/>
+            </w:pPr>
+            <w:r>
+              <w:rPr>
+                <w:rFonts w:ascii="Times New Roman" w:hAnsi="Times New Roman" w:cs="Times New Roman" w:eastAsia="Times New Roman"/>
+                <w:b w:val="0"/>
+                <w:sz w:val="20"/>
+              </w:rPr>
+              <w:t>"Tất cả dịch vụ" / "Dịch vụ đã chọn" (chỉ dòng ☑, ▣)</w:t>
+            </w:r>
+          </w:p>
+        </w:tc>
+      </w:tr>
+      <w:tr>
+        <w:tc>
+          <w:tcPr>
+            <w:tcW w:type="dxa" w:w="4103"/>
+          </w:tcPr>
+          <w:p>
+            <w:pPr>
+              <w:spacing w:after="0"/>
+            </w:pPr>
+            <w:r>
+              <w:rPr>
+                <w:rFonts w:ascii="Times New Roman" w:hAnsi="Times New Roman" w:cs="Times New Roman" w:eastAsia="Times New Roman"/>
+                <w:b w:val="0"/>
+                <w:sz w:val="20"/>
+              </w:rPr>
+              <w:t>Tìm kiếm</w:t>
+            </w:r>
+          </w:p>
+        </w:tc>
+        <w:tc>
+          <w:tcPr>
+            <w:tcW w:type="dxa" w:w="4923"/>
+          </w:tcPr>
+          <w:p>
+            <w:pPr>
+              <w:spacing w:after="0"/>
+            </w:pPr>
+            <w:r>
+              <w:rPr>
+                <w:rFonts w:ascii="Times New Roman" w:hAnsi="Times New Roman" w:cs="Times New Roman" w:eastAsia="Times New Roman"/>
+                <w:b w:val="0"/>
+                <w:sz w:val="20"/>
+              </w:rPr>
+              <w:t>Hàng lọc tự động theo mã, tên, loại dịch vụ</w:t>
+            </w:r>
+          </w:p>
+        </w:tc>
+      </w:tr>
+      <w:tr>
+        <w:tc>
+          <w:tcPr>
+            <w:tcW w:type="dxa" w:w="4103"/>
+          </w:tcPr>
+          <w:p>
+            <w:pPr>
+              <w:spacing w:after="0"/>
+            </w:pPr>
+            <w:r>
+              <w:rPr>
+                <w:rFonts w:ascii="Times New Roman" w:hAnsi="Times New Roman" w:cs="Times New Roman" w:eastAsia="Times New Roman"/>
+                <w:b w:val="0"/>
+                <w:sz w:val="20"/>
+              </w:rPr>
+              <w:t>Màu dòng</w:t>
+            </w:r>
+          </w:p>
+        </w:tc>
+        <w:tc>
+          <w:tcPr>
+            <w:tcW w:type="dxa" w:w="4923"/>
+          </w:tcPr>
+          <w:p>
+            <w:pPr>
+              <w:spacing w:after="0"/>
+            </w:pPr>
+            <w:r>
+              <w:rPr>
+                <w:rFonts w:ascii="Times New Roman" w:hAnsi="Times New Roman" w:cs="Times New Roman" w:eastAsia="Times New Roman"/>
+                <w:b w:val="0"/>
+                <w:sz w:val="20"/>
+              </w:rPr>
+              <w:t>Đỏ = sẽ xóa, xanh = sẽ thêm, cam (cột phòng) = đổi phòng</w:t>
+            </w:r>
+          </w:p>
+        </w:tc>
+      </w:tr>
+      <w:tr>
+        <w:tc>
+          <w:tcPr>
+            <w:tcW w:type="dxa" w:w="4103"/>
+          </w:tcPr>
+          <w:p>
+            <w:pPr>
+              <w:spacing w:after="0"/>
+            </w:pPr>
+            <w:r>
+              <w:rPr>
+                <w:rFonts w:ascii="Times New Roman" w:hAnsi="Times New Roman" w:cs="Times New Roman" w:eastAsia="Times New Roman"/>
+                <w:b w:val="0"/>
+                <w:sz w:val="20"/>
+              </w:rPr>
+              <w:t>Lưu</w:t>
+            </w:r>
+          </w:p>
+        </w:tc>
+        <w:tc>
+          <w:tcPr>
+            <w:tcW w:type="dxa" w:w="4923"/>
+          </w:tcPr>
+          <w:p>
+            <w:pPr>
+              <w:spacing w:after="0"/>
+            </w:pPr>
+            <w:r>
+              <w:rPr>
+                <w:rFonts w:ascii="Times New Roman" w:hAnsi="Times New Roman" w:cs="Times New Roman" w:eastAsia="Times New Roman"/>
+                <w:b w:val="0"/>
+                <w:sz w:val="20"/>
+              </w:rPr>
+              <w:t xml:space="preserve">Xác nhận "Áp dụng thay đổi cho N bệnh nhân?" → </w:t>
+            </w:r>
+            <w:r>
+              <w:rPr>
+                <w:rFonts w:ascii="Times New Roman" w:hAnsi="Times New Roman" w:cs="Times New Roman" w:eastAsia="Times New Roman"/>
+                <w:b/>
+                <w:sz w:val="20"/>
+              </w:rPr>
               <w:t>chia lô 200 hồ sơ/lần gọi API</w:t>
             </w:r>
             <w:r>
@@ -10907,33 +11051,7 @@
                 <w:b w:val="0"/>
                 <w:sz w:val="20"/>
               </w:rPr>
-              <w:t xml:space="preserve"> (mục 5.4) → gộp kết quả → mở </w:t>
-            </w:r>
-            <w:r>
-              <w:rPr>
-                <w:rFonts w:ascii="Consolas" w:hAnsi="Consolas" w:cs="Consolas" w:eastAsia="Consolas"/>
-                <w:b w:val="0"/>
-                <w:color w:val="C7254E"/>
-                <w:sz w:val="18"/>
-              </w:rPr>
-              <w:t>frmKskServiceEditResult</w:t>
-            </w:r>
-            <w:r>
-              <w:rPr>
-                <w:rFonts w:ascii="Times New Roman" w:hAnsi="Times New Roman" w:cs="Times New Roman" w:eastAsia="Times New Roman"/>
-                <w:b w:val="0"/>
-                <w:sz w:val="20"/>
-              </w:rPr>
-              <w:t xml:space="preserve"> → gọi </w:t>
-            </w:r>
-            <w:r>
-              <w:rPr>
-                <w:rFonts w:ascii="Consolas" w:hAnsi="Consolas" w:cs="Consolas" w:eastAsia="Consolas"/>
-                <w:b w:val="0"/>
-                <w:color w:val="C7254E"/>
-                <w:sz w:val="18"/>
-              </w:rPr>
-              <w:t>DelegateRefresh</w:t>
+              <w:t xml:space="preserve"> (mục 5.4) → màn hình kết quả → làm mới Hồ sơ điều trị</w:t>
             </w:r>
           </w:p>
         </w:tc>
@@ -12453,7 +12571,564 @@
           <w:rFonts w:ascii="Times New Roman" w:hAnsi="Times New Roman" w:cs="Times New Roman" w:eastAsia="Times New Roman"/>
           <w:b w:val="0"/>
         </w:rPr>
-        <w:t>7. Changelog</w:t>
+        <w:t>7. Triển khai (23/09/2026)</w:t>
+      </w:r>
+    </w:p>
+    <w:tbl>
+      <w:tblPr>
+        <w:tblStyle w:val="TableGrid"/>
+        <w:tblW w:type="auto" w:w="0"/>
+        <w:jc w:val="center"/>
+        <w:tblLayout w:type="fixed"/>
+        <w:tblLook w:firstColumn="1" w:firstRow="1" w:lastColumn="0" w:lastRow="0" w:noHBand="0" w:noVBand="1" w:val="04A0"/>
+      </w:tblPr>
+      <w:tblGrid>
+        <w:gridCol w:w="3009"/>
+        <w:gridCol w:w="3009"/>
+        <w:gridCol w:w="3009"/>
+      </w:tblGrid>
+      <w:tr>
+        <w:tc>
+          <w:tcPr>
+            <w:tcW w:type="dxa" w:w="1120"/>
+            <w:shd w:val="clear" w:color="auto" w:fill="DDEBF7"/>
+          </w:tcPr>
+          <w:p>
+            <w:pPr>
+              <w:spacing w:after="0"/>
+            </w:pPr>
+            <w:r>
+              <w:rPr>
+                <w:rFonts w:ascii="Times New Roman" w:hAnsi="Times New Roman" w:cs="Times New Roman" w:eastAsia="Times New Roman"/>
+                <w:b/>
+                <w:sz w:val="20"/>
+              </w:rPr>
+              <w:t>Phần</w:t>
+            </w:r>
+          </w:p>
+        </w:tc>
+        <w:tc>
+          <w:tcPr>
+            <w:tcW w:type="dxa" w:w="3953"/>
+            <w:shd w:val="clear" w:color="auto" w:fill="DDEBF7"/>
+          </w:tcPr>
+          <w:p>
+            <w:pPr>
+              <w:spacing w:after="0"/>
+            </w:pPr>
+            <w:r>
+              <w:rPr>
+                <w:rFonts w:ascii="Times New Roman" w:hAnsi="Times New Roman" w:cs="Times New Roman" w:eastAsia="Times New Roman"/>
+                <w:b/>
+                <w:sz w:val="20"/>
+              </w:rPr>
+              <w:t>Vị trí</w:t>
+            </w:r>
+          </w:p>
+        </w:tc>
+        <w:tc>
+          <w:tcPr>
+            <w:tcW w:type="dxa" w:w="3953"/>
+            <w:shd w:val="clear" w:color="auto" w:fill="DDEBF7"/>
+          </w:tcPr>
+          <w:p>
+            <w:pPr>
+              <w:spacing w:after="0"/>
+            </w:pPr>
+            <w:r>
+              <w:rPr>
+                <w:rFonts w:ascii="Times New Roman" w:hAnsi="Times New Roman" w:cs="Times New Roman" w:eastAsia="Times New Roman"/>
+                <w:b/>
+                <w:sz w:val="20"/>
+              </w:rPr>
+              <w:t>Ghi chú</w:t>
+            </w:r>
+          </w:p>
+        </w:tc>
+      </w:tr>
+      <w:tr>
+        <w:tc>
+          <w:tcPr>
+            <w:tcW w:type="dxa" w:w="1120"/>
+          </w:tcPr>
+          <w:p>
+            <w:pPr>
+              <w:spacing w:after="0"/>
+            </w:pPr>
+            <w:r>
+              <w:rPr>
+                <w:rFonts w:ascii="Times New Roman" w:hAnsi="Times New Roman" w:cs="Times New Roman" w:eastAsia="Times New Roman"/>
+                <w:b w:val="0"/>
+                <w:sz w:val="20"/>
+              </w:rPr>
+              <w:t>Nút "Sửa dịch vụ"</w:t>
+            </w:r>
+          </w:p>
+        </w:tc>
+        <w:tc>
+          <w:tcPr>
+            <w:tcW w:type="dxa" w:w="3953"/>
+          </w:tcPr>
+          <w:p>
+            <w:pPr>
+              <w:spacing w:after="0"/>
+            </w:pPr>
+            <w:r>
+              <w:rPr>
+                <w:rFonts w:ascii="Consolas" w:hAnsi="Consolas" w:cs="Consolas" w:eastAsia="Consolas"/>
+                <w:b w:val="0"/>
+                <w:color w:val="C7254E"/>
+                <w:sz w:val="18"/>
+              </w:rPr>
+              <w:t>HIS.Desktop.Plugins.TreatmentList/UCTreatmentList___KskServiceEdit.cs</w:t>
+            </w:r>
+          </w:p>
+        </w:tc>
+        <w:tc>
+          <w:tcPr>
+            <w:tcW w:type="dxa" w:w="3953"/>
+          </w:tcPr>
+          <w:p>
+            <w:pPr>
+              <w:spacing w:after="0"/>
+            </w:pPr>
+            <w:r>
+              <w:rPr>
+                <w:rFonts w:ascii="Consolas" w:hAnsi="Consolas" w:cs="Consolas" w:eastAsia="Consolas"/>
+                <w:b w:val="0"/>
+                <w:color w:val="C7254E"/>
+                <w:sz w:val="18"/>
+              </w:rPr>
+              <w:t>appliedKskContractId</w:t>
+            </w:r>
+            <w:r>
+              <w:rPr>
+                <w:rFonts w:ascii="Times New Roman" w:hAnsi="Times New Roman" w:cs="Times New Roman" w:eastAsia="Times New Roman"/>
+                <w:b w:val="0"/>
+                <w:sz w:val="20"/>
+              </w:rPr>
+              <w:t xml:space="preserve"> gán từ filter trong </w:t>
+            </w:r>
+            <w:r>
+              <w:rPr>
+                <w:rFonts w:ascii="Consolas" w:hAnsi="Consolas" w:cs="Consolas" w:eastAsia="Consolas"/>
+                <w:b w:val="0"/>
+                <w:color w:val="C7254E"/>
+                <w:sz w:val="18"/>
+              </w:rPr>
+              <w:t>FillDataToGridTreatment</w:t>
+            </w:r>
+            <w:r>
+              <w:rPr>
+                <w:rFonts w:ascii="Times New Roman" w:hAnsi="Times New Roman" w:cs="Times New Roman" w:eastAsia="Times New Roman"/>
+                <w:b w:val="0"/>
+                <w:sz w:val="20"/>
+              </w:rPr>
+              <w:t xml:space="preserve">; reset trong </w:t>
+            </w:r>
+            <w:r>
+              <w:rPr>
+                <w:rFonts w:ascii="Consolas" w:hAnsi="Consolas" w:cs="Consolas" w:eastAsia="Consolas"/>
+                <w:b w:val="0"/>
+                <w:color w:val="C7254E"/>
+                <w:sz w:val="18"/>
+              </w:rPr>
+              <w:t>SetDefaultControl</w:t>
+            </w:r>
+          </w:p>
+        </w:tc>
+      </w:tr>
+      <w:tr>
+        <w:tc>
+          <w:tcPr>
+            <w:tcW w:type="dxa" w:w="1120"/>
+          </w:tcPr>
+          <w:p>
+            <w:pPr>
+              <w:spacing w:after="0"/>
+            </w:pPr>
+            <w:r>
+              <w:rPr>
+                <w:rFonts w:ascii="Times New Roman" w:hAnsi="Times New Roman" w:cs="Times New Roman" w:eastAsia="Times New Roman"/>
+                <w:b w:val="0"/>
+                <w:sz w:val="20"/>
+              </w:rPr>
+              <w:t>Module mới</w:t>
+            </w:r>
+          </w:p>
+        </w:tc>
+        <w:tc>
+          <w:tcPr>
+            <w:tcW w:type="dxa" w:w="3953"/>
+          </w:tcPr>
+          <w:p>
+            <w:pPr>
+              <w:spacing w:after="0"/>
+            </w:pPr>
+            <w:r>
+              <w:rPr>
+                <w:rFonts w:ascii="Consolas" w:hAnsi="Consolas" w:cs="Consolas" w:eastAsia="Consolas"/>
+                <w:b w:val="0"/>
+                <w:color w:val="C7254E"/>
+                <w:sz w:val="18"/>
+              </w:rPr>
+              <w:t>HIS.Desktop.Plugins.KskServiceEditList</w:t>
+            </w:r>
+          </w:p>
+        </w:tc>
+        <w:tc>
+          <w:tcPr>
+            <w:tcW w:type="dxa" w:w="3953"/>
+          </w:tcPr>
+          <w:p>
+            <w:pPr>
+              <w:spacing w:after="0"/>
+            </w:pPr>
+            <w:r>
+              <w:rPr>
+                <w:rFonts w:ascii="Times New Roman" w:hAnsi="Times New Roman" w:cs="Times New Roman" w:eastAsia="Times New Roman"/>
+                <w:b w:val="0"/>
+                <w:sz w:val="20"/>
+              </w:rPr>
+              <w:t xml:space="preserve">Args </w:t>
+            </w:r>
+            <w:r>
+              <w:rPr>
+                <w:rFonts w:ascii="Consolas" w:hAnsi="Consolas" w:cs="Consolas" w:eastAsia="Consolas"/>
+                <w:b w:val="0"/>
+                <w:color w:val="C7254E"/>
+                <w:sz w:val="18"/>
+              </w:rPr>
+              <w:t>List&lt;V_HIS_TREATMENT_4&gt;</w:t>
+            </w:r>
+            <w:r>
+              <w:rPr>
+                <w:rFonts w:ascii="Times New Roman" w:hAnsi="Times New Roman" w:cs="Times New Roman" w:eastAsia="Times New Roman"/>
+                <w:b w:val="0"/>
+                <w:sz w:val="20"/>
+              </w:rPr>
+              <w:t xml:space="preserve"> (không cần gọi lại API lấy hồ sơ), </w:t>
+            </w:r>
+            <w:r>
+              <w:rPr>
+                <w:rFonts w:ascii="Consolas" w:hAnsi="Consolas" w:cs="Consolas" w:eastAsia="Consolas"/>
+                <w:b w:val="0"/>
+                <w:color w:val="C7254E"/>
+                <w:sz w:val="18"/>
+              </w:rPr>
+              <w:t>V_HIS_KSK_CONTRACT</w:t>
+            </w:r>
+            <w:r>
+              <w:rPr>
+                <w:rFonts w:ascii="Times New Roman" w:hAnsi="Times New Roman" w:cs="Times New Roman" w:eastAsia="Times New Roman"/>
+                <w:b w:val="0"/>
+                <w:sz w:val="20"/>
+              </w:rPr>
+              <w:t xml:space="preserve">, </w:t>
+            </w:r>
+            <w:r>
+              <w:rPr>
+                <w:rFonts w:ascii="Consolas" w:hAnsi="Consolas" w:cs="Consolas" w:eastAsia="Consolas"/>
+                <w:b w:val="0"/>
+                <w:color w:val="C7254E"/>
+                <w:sz w:val="18"/>
+              </w:rPr>
+              <w:t>RefeshReference</w:t>
+            </w:r>
+            <w:r>
+              <w:rPr>
+                <w:rFonts w:ascii="Times New Roman" w:hAnsi="Times New Roman" w:cs="Times New Roman" w:eastAsia="Times New Roman"/>
+                <w:b w:val="0"/>
+                <w:sz w:val="20"/>
+              </w:rPr>
+              <w:t>; SDO khai báo bản sao trong plugin</w:t>
+            </w:r>
+          </w:p>
+        </w:tc>
+      </w:tr>
+      <w:tr>
+        <w:tc>
+          <w:tcPr>
+            <w:tcW w:type="dxa" w:w="1120"/>
+          </w:tcPr>
+          <w:p>
+            <w:pPr>
+              <w:spacing w:after="0"/>
+            </w:pPr>
+            <w:r>
+              <w:rPr>
+                <w:rFonts w:ascii="Times New Roman" w:hAnsi="Times New Roman" w:cs="Times New Roman" w:eastAsia="Times New Roman"/>
+                <w:b w:val="0"/>
+                <w:sz w:val="20"/>
+              </w:rPr>
+              <w:t>API</w:t>
+            </w:r>
+          </w:p>
+        </w:tc>
+        <w:tc>
+          <w:tcPr>
+            <w:tcW w:type="dxa" w:w="3953"/>
+          </w:tcPr>
+          <w:p>
+            <w:pPr>
+              <w:spacing w:after="0"/>
+            </w:pPr>
+            <w:r>
+              <w:rPr>
+                <w:rFonts w:ascii="Times New Roman" w:hAnsi="Times New Roman" w:cs="Times New Roman" w:eastAsia="Times New Roman"/>
+                <w:b w:val="0"/>
+                <w:sz w:val="20"/>
+              </w:rPr>
+              <w:t xml:space="preserve">MOS </w:t>
+            </w:r>
+            <w:r>
+              <w:rPr>
+                <w:rFonts w:ascii="Consolas" w:hAnsi="Consolas" w:cs="Consolas" w:eastAsia="Consolas"/>
+                <w:b w:val="0"/>
+                <w:color w:val="C7254E"/>
+                <w:sz w:val="18"/>
+              </w:rPr>
+              <w:t>api/HisKskContract/ServiceEdit</w:t>
+            </w:r>
+          </w:p>
+        </w:tc>
+        <w:tc>
+          <w:tcPr>
+            <w:tcW w:type="dxa" w:w="3953"/>
+          </w:tcPr>
+          <w:p>
+            <w:pPr>
+              <w:spacing w:after="0"/>
+            </w:pPr>
+            <w:r>
+              <w:rPr>
+                <w:rFonts w:ascii="Consolas" w:hAnsi="Consolas" w:cs="Consolas" w:eastAsia="Consolas"/>
+                <w:b w:val="0"/>
+                <w:color w:val="C7254E"/>
+                <w:sz w:val="18"/>
+              </w:rPr>
+              <w:t>MOS.MANAGER/HisKskContract/ServiceEdit/*</w:t>
+            </w:r>
+            <w:r>
+              <w:rPr>
+                <w:rFonts w:ascii="Times New Roman" w:hAnsi="Times New Roman" w:cs="Times New Roman" w:eastAsia="Times New Roman"/>
+                <w:b w:val="0"/>
+                <w:sz w:val="20"/>
+              </w:rPr>
+              <w:t xml:space="preserve">, </w:t>
+            </w:r>
+            <w:r>
+              <w:rPr>
+                <w:rFonts w:ascii="Consolas" w:hAnsi="Consolas" w:cs="Consolas" w:eastAsia="Consolas"/>
+                <w:b w:val="0"/>
+                <w:color w:val="C7254E"/>
+                <w:sz w:val="18"/>
+              </w:rPr>
+              <w:t>MOS.SDO/HisKskServiceEditSDO.cs</w:t>
+            </w:r>
+            <w:r>
+              <w:rPr>
+                <w:rFonts w:ascii="Times New Roman" w:hAnsi="Times New Roman" w:cs="Times New Roman" w:eastAsia="Times New Roman"/>
+                <w:b w:val="0"/>
+                <w:sz w:val="20"/>
+              </w:rPr>
+              <w:t xml:space="preserve">; 8 message mới </w:t>
+            </w:r>
+            <w:r>
+              <w:rPr>
+                <w:rFonts w:ascii="Consolas" w:hAnsi="Consolas" w:cs="Consolas" w:eastAsia="Consolas"/>
+                <w:b w:val="0"/>
+                <w:color w:val="C7254E"/>
+                <w:sz w:val="18"/>
+              </w:rPr>
+              <w:t>HisKskContract_*</w:t>
+            </w:r>
+            <w:r>
+              <w:rPr>
+                <w:rFonts w:ascii="Times New Roman" w:hAnsi="Times New Roman" w:cs="Times New Roman" w:eastAsia="Times New Roman"/>
+                <w:b w:val="0"/>
+                <w:sz w:val="20"/>
+              </w:rPr>
+              <w:t xml:space="preserve"> (MOS.LibraryMessage), 2 EventLog mới </w:t>
+            </w:r>
+            <w:r>
+              <w:rPr>
+                <w:rFonts w:ascii="Consolas" w:hAnsi="Consolas" w:cs="Consolas" w:eastAsia="Consolas"/>
+                <w:b w:val="0"/>
+                <w:color w:val="C7254E"/>
+                <w:sz w:val="18"/>
+              </w:rPr>
+              <w:t>HisKskContract_SuaDichVu_*</w:t>
+            </w:r>
+          </w:p>
+        </w:tc>
+      </w:tr>
+      <w:tr>
+        <w:tc>
+          <w:tcPr>
+            <w:tcW w:type="dxa" w:w="1120"/>
+          </w:tcPr>
+          <w:p>
+            <w:pPr>
+              <w:spacing w:after="0"/>
+            </w:pPr>
+            <w:r>
+              <w:rPr>
+                <w:rFonts w:ascii="Times New Roman" w:hAnsi="Times New Roman" w:cs="Times New Roman" w:eastAsia="Times New Roman"/>
+                <w:b w:val="0"/>
+                <w:sz w:val="20"/>
+              </w:rPr>
+              <w:t>Tài liệu module</w:t>
+            </w:r>
+          </w:p>
+        </w:tc>
+        <w:tc>
+          <w:tcPr>
+            <w:tcW w:type="dxa" w:w="3953"/>
+          </w:tcPr>
+          <w:p>
+            <w:pPr>
+              <w:spacing w:after="0"/>
+            </w:pPr>
+            <w:r>
+              <w:rPr>
+                <w:rFonts w:ascii="Consolas" w:hAnsi="Consolas" w:cs="Consolas" w:eastAsia="Consolas"/>
+                <w:b w:val="0"/>
+                <w:color w:val="C7254E"/>
+                <w:sz w:val="18"/>
+              </w:rPr>
+              <w:t>docs/HIS.Desktop.Plugins.KskServiceEditList.md</w:t>
+            </w:r>
+          </w:p>
+        </w:tc>
+        <w:tc>
+          <w:tcPr>
+            <w:tcW w:type="dxa" w:w="3953"/>
+          </w:tcPr>
+          <w:p>
+            <w:pPr>
+              <w:spacing w:after="0"/>
+            </w:pPr>
+            <w:r>
+              <w:rPr>
+                <w:rFonts w:ascii="Times New Roman" w:hAnsi="Times New Roman" w:cs="Times New Roman" w:eastAsia="Times New Roman"/>
+                <w:b w:val="0"/>
+                <w:sz w:val="20"/>
+              </w:rPr>
+              <w:t>9 mục</w:t>
+            </w:r>
+          </w:p>
+        </w:tc>
+      </w:tr>
+    </w:tbl>
+    <w:p>
+      <w:pPr>
+        <w:spacing w:after="0"/>
+      </w:pPr>
+    </w:p>
+    <w:p>
+      <w:r>
+        <w:rPr>
+          <w:rFonts w:ascii="Times New Roman" w:hAnsi="Times New Roman" w:cs="Times New Roman" w:eastAsia="Times New Roman"/>
+          <w:b/>
+        </w:rPr>
+        <w:t>Việc cần làm khi triển khai:</w:t>
+      </w:r>
+    </w:p>
+    <w:p>
+      <w:pPr>
+        <w:pStyle w:val="ListNumber"/>
+      </w:pPr>
+      <w:r>
+        <w:rPr>
+          <w:rFonts w:ascii="Times New Roman" w:hAnsi="Times New Roman" w:cs="Times New Roman" w:eastAsia="Times New Roman"/>
+          <w:b w:val="0"/>
+        </w:rPr>
+        <w:t>Deploy backend MOS (MOS.API, MOS.MANAGER, MOS.SDO, MOS.LibraryMessage, MOS.LibraryEventLog).</w:t>
+      </w:r>
+    </w:p>
+    <w:p>
+      <w:pPr>
+        <w:pStyle w:val="ListNumber"/>
+      </w:pPr>
+      <w:r>
+        <w:rPr>
+          <w:rFonts w:ascii="Times New Roman" w:hAnsi="Times New Roman" w:cs="Times New Roman" w:eastAsia="Times New Roman"/>
+          <w:b w:val="0"/>
+        </w:rPr>
+        <w:t xml:space="preserve">Khai báo module </w:t>
+      </w:r>
+      <w:r>
+        <w:rPr>
+          <w:rFonts w:ascii="Consolas" w:hAnsi="Consolas" w:cs="Consolas" w:eastAsia="Consolas"/>
+          <w:b w:val="0"/>
+          <w:color w:val="C7254E"/>
+          <w:sz w:val="20"/>
+        </w:rPr>
+        <w:t>HIS.Desktop.Plugins.KskServiceEditList</w:t>
+      </w:r>
+      <w:r>
+        <w:rPr>
+          <w:rFonts w:ascii="Times New Roman" w:hAnsi="Times New Roman" w:cs="Times New Roman" w:eastAsia="Times New Roman"/>
+          <w:b w:val="0"/>
+        </w:rPr>
+        <w:t xml:space="preserve"> trong ACS (ACS_MODULE) và quyền API </w:t>
+      </w:r>
+      <w:r>
+        <w:rPr>
+          <w:rFonts w:ascii="Consolas" w:hAnsi="Consolas" w:cs="Consolas" w:eastAsia="Consolas"/>
+          <w:b w:val="0"/>
+          <w:color w:val="C7254E"/>
+          <w:sz w:val="20"/>
+        </w:rPr>
+        <w:t>api/HisKskContract/ServiceEdit</w:t>
+      </w:r>
+      <w:r>
+        <w:rPr>
+          <w:rFonts w:ascii="Times New Roman" w:hAnsi="Times New Roman" w:cs="Times New Roman" w:eastAsia="Times New Roman"/>
+          <w:b w:val="0"/>
+        </w:rPr>
+        <w:t>.</w:t>
+      </w:r>
+    </w:p>
+    <w:p>
+      <w:pPr>
+        <w:pStyle w:val="ListNumber"/>
+      </w:pPr>
+      <w:r>
+        <w:rPr>
+          <w:rFonts w:ascii="Times New Roman" w:hAnsi="Times New Roman" w:cs="Times New Roman" w:eastAsia="Times New Roman"/>
+          <w:b w:val="0"/>
+        </w:rPr>
+        <w:t xml:space="preserve">(Tùy chọn) Khai báo ACS_CONTROL </w:t>
+      </w:r>
+      <w:r>
+        <w:rPr>
+          <w:rFonts w:ascii="Consolas" w:hAnsi="Consolas" w:cs="Consolas" w:eastAsia="Consolas"/>
+          <w:b w:val="0"/>
+          <w:color w:val="C7254E"/>
+          <w:sz w:val="20"/>
+        </w:rPr>
+        <w:t>HIS000060</w:t>
+      </w:r>
+      <w:r>
+        <w:rPr>
+          <w:rFonts w:ascii="Times New Roman" w:hAnsi="Times New Roman" w:cs="Times New Roman" w:eastAsia="Times New Roman"/>
+          <w:b w:val="0"/>
+        </w:rPr>
+        <w:t xml:space="preserve"> để phân quyền nút.</w:t>
+      </w:r>
+    </w:p>
+    <w:p>
+      <w:pPr>
+        <w:pStyle w:val="Heading1"/>
+      </w:pPr>
+      <w:r>
+        <w:rPr>
+          <w:rFonts w:ascii="Times New Roman" w:hAnsi="Times New Roman" w:cs="Times New Roman" w:eastAsia="Times New Roman"/>
+          <w:b w:val="0"/>
+        </w:rPr>
+        <w:t>8. Changelog</w:t>
       </w:r>
     </w:p>
     <w:tbl>
@@ -12644,6 +13319,82 @@
                 <w:sz w:val="20"/>
               </w:rPr>
               <w:t>Chốt: xóa hết dịch vụ của y lệnh → báo lỗi, không xóa; frontend chia lô 200 hồ sơ/lần gọi API (mục 5.4)</w:t>
+            </w:r>
+          </w:p>
+        </w:tc>
+      </w:tr>
+      <w:tr>
+        <w:tc>
+          <w:tcPr>
+            <w:tcW w:type="dxa" w:w="1289"/>
+          </w:tcPr>
+          <w:p>
+            <w:pPr>
+              <w:spacing w:after="0"/>
+            </w:pPr>
+            <w:r>
+              <w:rPr>
+                <w:rFonts w:ascii="Times New Roman" w:hAnsi="Times New Roman" w:cs="Times New Roman" w:eastAsia="Times New Roman"/>
+                <w:b w:val="0"/>
+                <w:sz w:val="20"/>
+              </w:rPr>
+              <w:t>2026-09-23</w:t>
+            </w:r>
+          </w:p>
+        </w:tc>
+        <w:tc>
+          <w:tcPr>
+            <w:tcW w:type="dxa" w:w="7737"/>
+          </w:tcPr>
+          <w:p>
+            <w:pPr>
+              <w:spacing w:after="0"/>
+            </w:pPr>
+            <w:r>
+              <w:rPr>
+                <w:rFonts w:ascii="Times New Roman" w:hAnsi="Times New Roman" w:cs="Times New Roman" w:eastAsia="Times New Roman"/>
+                <w:b w:val="0"/>
+                <w:sz w:val="20"/>
+              </w:rPr>
+              <w:t>Triển khai code: TreatmentList, module KskServiceEditList, API MOS HisKskContract/ServiceEdit (mục 7)</w:t>
+            </w:r>
+          </w:p>
+        </w:tc>
+      </w:tr>
+      <w:tr>
+        <w:tc>
+          <w:tcPr>
+            <w:tcW w:type="dxa" w:w="1289"/>
+          </w:tcPr>
+          <w:p>
+            <w:pPr>
+              <w:spacing w:after="0"/>
+            </w:pPr>
+            <w:r>
+              <w:rPr>
+                <w:rFonts w:ascii="Times New Roman" w:hAnsi="Times New Roman" w:cs="Times New Roman" w:eastAsia="Times New Roman"/>
+                <w:b w:val="0"/>
+                <w:sz w:val="20"/>
+              </w:rPr>
+              <w:t>2026-09-24</w:t>
+            </w:r>
+          </w:p>
+        </w:tc>
+        <w:tc>
+          <w:tcPr>
+            <w:tcW w:type="dxa" w:w="7737"/>
+          </w:tcPr>
+          <w:p>
+            <w:pPr>
+              <w:spacing w:after="0"/>
+            </w:pPr>
+            <w:r>
+              <w:rPr>
+                <w:rFonts w:ascii="Times New Roman" w:hAnsi="Times New Roman" w:cs="Times New Roman" w:eastAsia="Times New Roman"/>
+                <w:b w:val="0"/>
+                <w:sz w:val="20"/>
+              </w:rPr>
+              <w:t>Màn hình Sửa dịch vụ đổi sang luồng hiển thị/xử lý giống "Sửa chỉ định dịch vụ" (mục 5.2); API giữ nguyên</w:t>
             </w:r>
           </w:p>
         </w:tc>

</xml_diff>